<commit_message>
Add operational (back-of-house) workflows per product type
- New §12 in Product Workflows: operational flow, RACI, lead-time/SLA, and
  exceptions for ready-made, private/unlisted, configurable shelves, hybrid,
  and Atelier3d custom build
- Cross-cutting ops flows (materials/inventory, render-vs-build QA, returns/
  rework/warranty, capacity), an operational RACI-by-stage matrix, and
  operational metrics feeding Master Plan KPIs
- Regenerate Word docs

https://claude.ai/code/session_01PjUHwFTYmLhh9nLNKk68Yq
</commit_message>
<xml_diff>
--- a/word/03-Product-Workflows.docx
+++ b/word/03-Product-Workflows.docx
@@ -220,6 +220,29 @@
       </w:r>
       <w:r>
         <w:t>.</w:t>
+      </w:r>
+    </w:p>
+    <w:p>
+      <w:r>
+        <w:t xml:space="preserve">Workflows A–H below cover the </w:t>
+      </w:r>
+      <w:r>
+        <w:rPr>
+          <w:b/>
+        </w:rPr>
+        <w:t>customer &amp; system</w:t>
+      </w:r>
+      <w:r>
+        <w:t xml:space="preserve"> path. </w:t>
+      </w:r>
+      <w:r>
+        <w:rPr>
+          <w:b/>
+        </w:rPr>
+        <w:t>§12 adds the operational (back-of-house) workflow</w:t>
+      </w:r>
+      <w:r>
+        <w:t xml:space="preserve"> the production/ops team follows to fulfill each product type — intake, spec verification, sourcing, build, QA, pack, ship, and close-out.</w:t>
       </w:r>
     </w:p>
     <w:p>
@@ -3221,11 +3244,1836 @@
       </w:pPr>
     </w:p>
     <w:p>
+      <w:pPr>
+        <w:pStyle w:val="Heading2"/>
+      </w:pPr>
+      <w:r>
+        <w:t>12. Operational workflows (back-of-house) — per product type</w:t>
+      </w:r>
+    </w:p>
+    <w:p>
+      <w:r>
+        <w:t xml:space="preserve">Workflows A–H describe the </w:t>
+      </w:r>
+      <w:r>
+        <w:rPr>
+          <w:b/>
+        </w:rPr>
+        <w:t>customer &amp; system</w:t>
+      </w:r>
+      <w:r>
+        <w:t xml:space="preserve"> journey. This part describes what the </w:t>
+      </w:r>
+      <w:r>
+        <w:rPr>
+          <w:b/>
+        </w:rPr>
+        <w:t>operations / production team</w:t>
+      </w:r>
+      <w:r>
+        <w:t xml:space="preserve"> does once an order is placed, for each product type. The shared starting point is the </w:t>
+      </w:r>
+      <w:r>
+        <w:rPr>
+          <w:b/>
+        </w:rPr>
+        <w:t>production packet</w:t>
+      </w:r>
+      <w:r>
+        <w:t xml:space="preserve"> from Workflow H (configuration + BOM + the approved 4K render + customer details). </w:t>
+      </w:r>
+      <w:r>
+        <w:rPr>
+          <w:b/>
+        </w:rPr>
+        <w:t>The approved 4K render is the visual spec of record</w:t>
+      </w:r>
+      <w:r>
+        <w:t xml:space="preserve"> — QA builds and checks against it.</w:t>
+      </w:r>
+    </w:p>
+    <w:p>
+      <w:r>
+        <w:rPr>
+          <w:b/>
+        </w:rPr>
+        <w:t>Operational role codes:</w:t>
+      </w:r>
+    </w:p>
+    <w:tbl>
+      <w:tblPr>
+        <w:tblStyle w:val="LightGrid-Accent1"/>
+        <w:tblW w:type="auto" w:w="0"/>
+        <w:tblLayout w:type="autofit"/>
+        <w:tblLook w:firstColumn="1" w:firstRow="1" w:lastColumn="0" w:lastRow="0" w:noHBand="0" w:noVBand="1" w:val="04A0"/>
+      </w:tblPr>
+      <w:tblGrid>
+        <w:gridCol w:w="4824"/>
+        <w:gridCol w:w="4824"/>
+      </w:tblGrid>
+      <w:tr>
+        <w:tc>
+          <w:tcPr>
+            <w:tcW w:type="dxa" w:w="4824"/>
+          </w:tcPr>
+          <w:p>
+            <w:r>
+              <w:rPr>
+                <w:b/>
+              </w:rPr>
+              <w:t>Code</w:t>
+            </w:r>
+          </w:p>
+        </w:tc>
+        <w:tc>
+          <w:tcPr>
+            <w:tcW w:type="dxa" w:w="4824"/>
+          </w:tcPr>
+          <w:p>
+            <w:r>
+              <w:rPr>
+                <w:b/>
+              </w:rPr>
+              <w:t>Role</w:t>
+            </w:r>
+          </w:p>
+        </w:tc>
+      </w:tr>
+      <w:tr>
+        <w:tc>
+          <w:tcPr>
+            <w:tcW w:type="dxa" w:w="4824"/>
+          </w:tcPr>
+          <w:p>
+            <w:r>
+              <w:rPr>
+                <w:b/>
+              </w:rPr>
+              <w:t>CS</w:t>
+            </w:r>
+          </w:p>
+        </w:tc>
+        <w:tc>
+          <w:tcPr>
+            <w:tcW w:type="dxa" w:w="4824"/>
+          </w:tcPr>
+          <w:p>
+            <w:r>
+              <w:t>Sales / Customer Service</w:t>
+            </w:r>
+          </w:p>
+        </w:tc>
+      </w:tr>
+      <w:tr>
+        <w:tc>
+          <w:tcPr>
+            <w:tcW w:type="dxa" w:w="4824"/>
+          </w:tcPr>
+          <w:p>
+            <w:r>
+              <w:rPr>
+                <w:b/>
+              </w:rPr>
+              <w:t>OPS</w:t>
+            </w:r>
+          </w:p>
+        </w:tc>
+        <w:tc>
+          <w:tcPr>
+            <w:tcW w:type="dxa" w:w="4824"/>
+          </w:tcPr>
+          <w:p>
+            <w:r>
+              <w:t>Production scheduler / Ops lead</w:t>
+            </w:r>
+          </w:p>
+        </w:tc>
+      </w:tr>
+      <w:tr>
+        <w:tc>
+          <w:tcPr>
+            <w:tcW w:type="dxa" w:w="4824"/>
+          </w:tcPr>
+          <w:p>
+            <w:r>
+              <w:rPr>
+                <w:b/>
+              </w:rPr>
+              <w:t>MK</w:t>
+            </w:r>
+          </w:p>
+        </w:tc>
+        <w:tc>
+          <w:tcPr>
+            <w:tcW w:type="dxa" w:w="4824"/>
+          </w:tcPr>
+          <w:p>
+            <w:r>
+              <w:t>Maker / craftsperson (incl. finishing)</w:t>
+            </w:r>
+          </w:p>
+        </w:tc>
+      </w:tr>
+      <w:tr>
+        <w:tc>
+          <w:tcPr>
+            <w:tcW w:type="dxa" w:w="4824"/>
+          </w:tcPr>
+          <w:p>
+            <w:r>
+              <w:rPr>
+                <w:b/>
+              </w:rPr>
+              <w:t>QA</w:t>
+            </w:r>
+          </w:p>
+        </w:tc>
+        <w:tc>
+          <w:tcPr>
+            <w:tcW w:type="dxa" w:w="4824"/>
+          </w:tcPr>
+          <w:p>
+            <w:r>
+              <w:t>Quality control</w:t>
+            </w:r>
+          </w:p>
+        </w:tc>
+      </w:tr>
+      <w:tr>
+        <w:tc>
+          <w:tcPr>
+            <w:tcW w:type="dxa" w:w="4824"/>
+          </w:tcPr>
+          <w:p>
+            <w:r>
+              <w:rPr>
+                <w:b/>
+              </w:rPr>
+              <w:t>SHIP</w:t>
+            </w:r>
+          </w:p>
+        </w:tc>
+        <w:tc>
+          <w:tcPr>
+            <w:tcW w:type="dxa" w:w="4824"/>
+          </w:tcPr>
+          <w:p>
+            <w:r>
+              <w:t>Fulfillment / shipping</w:t>
+            </w:r>
+          </w:p>
+        </w:tc>
+      </w:tr>
+      <w:tr>
+        <w:tc>
+          <w:tcPr>
+            <w:tcW w:type="dxa" w:w="4824"/>
+          </w:tcPr>
+          <w:p>
+            <w:r>
+              <w:rPr>
+                <w:b/>
+              </w:rPr>
+              <w:t>SYS</w:t>
+            </w:r>
+          </w:p>
+        </w:tc>
+        <w:tc>
+          <w:tcPr>
+            <w:tcW w:type="dxa" w:w="4824"/>
+          </w:tcPr>
+          <w:p>
+            <w:r>
+              <w:t>Integration Layer / CRM (automated)</w:t>
+            </w:r>
+          </w:p>
+        </w:tc>
+      </w:tr>
+    </w:tbl>
+    <w:p/>
+    <w:p>
+      <w:pPr>
+        <w:pBdr>
+          <w:bottom w:val="single" w:sz="6" w:space="1" w:color="BBBBBB"/>
+        </w:pBdr>
+      </w:pPr>
+    </w:p>
+    <w:p>
+      <w:pPr>
+        <w:pStyle w:val="Heading3"/>
+      </w:pPr>
+      <w:r>
+        <w:t>12.1 Ready-Made — operations</w:t>
+      </w:r>
+    </w:p>
+    <w:p>
       <w:r>
         <w:rPr>
           <w:i/>
-        </w:rPr>
-        <w:t>End of Product Workflows (Draft v0.1). Please approve the flows and the open question in §10.</w:t>
+          <w:color w:val="666666"/>
+          <w:sz w:val="18"/>
+        </w:rPr>
+        <w:t>Diagram (Mermaid source — renders as a diagram on GitHub):</w:t>
+      </w:r>
+    </w:p>
+    <w:p>
+      <w:pPr>
+        <w:shd w:val="clear" w:color="auto" w:fill="F4F4F2"/>
+        <w:ind w:left="216" w:right="216"/>
+      </w:pPr>
+      <w:r>
+        <w:rPr>
+          <w:rFonts w:ascii="Consolas" w:hAnsi="Consolas"/>
+          <w:sz w:val="18"/>
+        </w:rPr>
+        <w:t>flowchart LR</w:t>
+      </w:r>
+      <w:r>
+        <w:br/>
+      </w:r>
+      <w:r>
+        <w:rPr>
+          <w:rFonts w:ascii="Consolas" w:hAnsi="Consolas"/>
+          <w:sz w:val="18"/>
+        </w:rPr>
+        <w:t xml:space="preserve">    O[Order paid] --&gt; S{In stock?}</w:t>
+      </w:r>
+      <w:r>
+        <w:br/>
+      </w:r>
+      <w:r>
+        <w:rPr>
+          <w:rFonts w:ascii="Consolas" w:hAnsi="Consolas"/>
+          <w:sz w:val="18"/>
+        </w:rPr>
+        <w:t xml:space="preserve">    S --&gt;|Yes| P[Pick from inventory]</w:t>
+      </w:r>
+      <w:r>
+        <w:br/>
+      </w:r>
+      <w:r>
+        <w:rPr>
+          <w:rFonts w:ascii="Consolas" w:hAnsi="Consolas"/>
+          <w:sz w:val="18"/>
+        </w:rPr>
+        <w:t xml:space="preserve">    S --&gt;|No| B[Build to standard spec / backorder comms]</w:t>
+      </w:r>
+      <w:r>
+        <w:br/>
+      </w:r>
+      <w:r>
+        <w:rPr>
+          <w:rFonts w:ascii="Consolas" w:hAnsi="Consolas"/>
+          <w:sz w:val="18"/>
+        </w:rPr>
+        <w:t xml:space="preserve">    P --&gt; Q[QA spot-check]</w:t>
+      </w:r>
+      <w:r>
+        <w:br/>
+      </w:r>
+      <w:r>
+        <w:rPr>
+          <w:rFonts w:ascii="Consolas" w:hAnsi="Consolas"/>
+          <w:sz w:val="18"/>
+        </w:rPr>
+        <w:t xml:space="preserve">    B --&gt; Q</w:t>
+      </w:r>
+      <w:r>
+        <w:br/>
+      </w:r>
+      <w:r>
+        <w:rPr>
+          <w:rFonts w:ascii="Consolas" w:hAnsi="Consolas"/>
+          <w:sz w:val="18"/>
+        </w:rPr>
+        <w:t xml:space="preserve">    Q --&gt; PK[Pack]</w:t>
+      </w:r>
+      <w:r>
+        <w:br/>
+      </w:r>
+      <w:r>
+        <w:rPr>
+          <w:rFonts w:ascii="Consolas" w:hAnsi="Consolas"/>
+          <w:sz w:val="18"/>
+        </w:rPr>
+        <w:t xml:space="preserve">    PK --&gt; SH[Ship + tracking]</w:t>
+      </w:r>
+      <w:r>
+        <w:br/>
+      </w:r>
+      <w:r>
+        <w:rPr>
+          <w:rFonts w:ascii="Consolas" w:hAnsi="Consolas"/>
+          <w:sz w:val="18"/>
+        </w:rPr>
+        <w:t xml:space="preserve">    SH --&gt; CL[Close order · restock if reorder point hit]</w:t>
+      </w:r>
+    </w:p>
+    <w:p>
+      <w:pPr>
+        <w:pStyle w:val="ListBullet"/>
+      </w:pPr>
+      <w:r>
+        <w:rPr>
+          <w:b/>
+        </w:rPr>
+        <w:t>Owner:</w:t>
+      </w:r>
+      <w:r>
+        <w:t xml:space="preserve"> SHIP (stocked) or MK→SHIP (made-to-order); OPS accountable.</w:t>
+      </w:r>
+    </w:p>
+    <w:p>
+      <w:pPr>
+        <w:pStyle w:val="ListBullet"/>
+      </w:pPr>
+      <w:r>
+        <w:rPr>
+          <w:b/>
+        </w:rPr>
+        <w:t>Lead time / SLA:</w:t>
+      </w:r>
+      <w:r>
+        <w:t xml:space="preserve"> in-stock ship in 1–2 business days; made-to-order standard 1–2 weeks.</w:t>
+      </w:r>
+    </w:p>
+    <w:p>
+      <w:pPr>
+        <w:pStyle w:val="ListBullet"/>
+      </w:pPr>
+      <w:r>
+        <w:rPr>
+          <w:b/>
+        </w:rPr>
+        <w:t>Exceptions:</w:t>
+      </w:r>
+      <w:r>
+        <w:t xml:space="preserve"> out of stock → backorder comms + ETA (CS); failed spot-check → pull + replace.</w:t>
+      </w:r>
+    </w:p>
+    <w:p>
+      <w:pPr>
+        <w:pStyle w:val="Heading3"/>
+      </w:pPr>
+      <w:r>
+        <w:t>12.2 Private / Unlisted (locked) — operations</w:t>
+      </w:r>
+    </w:p>
+    <w:p>
+      <w:r>
+        <w:rPr>
+          <w:i/>
+          <w:color w:val="666666"/>
+          <w:sz w:val="18"/>
+        </w:rPr>
+        <w:t>Diagram (Mermaid source — renders as a diagram on GitHub):</w:t>
+      </w:r>
+    </w:p>
+    <w:p>
+      <w:pPr>
+        <w:shd w:val="clear" w:color="auto" w:fill="F4F4F2"/>
+        <w:ind w:left="216" w:right="216"/>
+      </w:pPr>
+      <w:r>
+        <w:rPr>
+          <w:rFonts w:ascii="Consolas" w:hAnsi="Consolas"/>
+          <w:sz w:val="18"/>
+        </w:rPr>
+        <w:t>flowchart LR</w:t>
+      </w:r>
+      <w:r>
+        <w:br/>
+      </w:r>
+      <w:r>
+        <w:rPr>
+          <w:rFonts w:ascii="Consolas" w:hAnsi="Consolas"/>
+          <w:sz w:val="18"/>
+        </w:rPr>
+        <w:t xml:space="preserve">    O[Order paid · locked spec] --&gt; V[Verify spec vs CRM quote]</w:t>
+      </w:r>
+      <w:r>
+        <w:br/>
+      </w:r>
+      <w:r>
+        <w:rPr>
+          <w:rFonts w:ascii="Consolas" w:hAnsi="Consolas"/>
+          <w:sz w:val="18"/>
+        </w:rPr>
+        <w:t xml:space="preserve">    V --&gt; SRC[Source materials per BOM]</w:t>
+      </w:r>
+      <w:r>
+        <w:br/>
+      </w:r>
+      <w:r>
+        <w:rPr>
+          <w:rFonts w:ascii="Consolas" w:hAnsi="Consolas"/>
+          <w:sz w:val="18"/>
+        </w:rPr>
+        <w:t xml:space="preserve">    SRC --&gt; MK[Build to locked spec]</w:t>
+      </w:r>
+      <w:r>
+        <w:br/>
+      </w:r>
+      <w:r>
+        <w:rPr>
+          <w:rFonts w:ascii="Consolas" w:hAnsi="Consolas"/>
+          <w:sz w:val="18"/>
+        </w:rPr>
+        <w:t xml:space="preserve">    MK --&gt; QA[QA vs approved 4K render]</w:t>
+      </w:r>
+      <w:r>
+        <w:br/>
+      </w:r>
+      <w:r>
+        <w:rPr>
+          <w:rFonts w:ascii="Consolas" w:hAnsi="Consolas"/>
+          <w:sz w:val="18"/>
+        </w:rPr>
+        <w:t xml:space="preserve">    QA --&gt;|pass| PK[Pack with approval proof]</w:t>
+      </w:r>
+      <w:r>
+        <w:br/>
+      </w:r>
+      <w:r>
+        <w:rPr>
+          <w:rFonts w:ascii="Consolas" w:hAnsi="Consolas"/>
+          <w:sz w:val="18"/>
+        </w:rPr>
+        <w:t xml:space="preserve">    QA --&gt;|fail| RW[Rework]</w:t>
+      </w:r>
+      <w:r>
+        <w:br/>
+      </w:r>
+      <w:r>
+        <w:rPr>
+          <w:rFonts w:ascii="Consolas" w:hAnsi="Consolas"/>
+          <w:sz w:val="18"/>
+        </w:rPr>
+        <w:t xml:space="preserve">    RW --&gt; QA</w:t>
+      </w:r>
+      <w:r>
+        <w:br/>
+      </w:r>
+      <w:r>
+        <w:rPr>
+          <w:rFonts w:ascii="Consolas" w:hAnsi="Consolas"/>
+          <w:sz w:val="18"/>
+        </w:rPr>
+        <w:t xml:space="preserve">    PK --&gt; SH[Ship]</w:t>
+      </w:r>
+      <w:r>
+        <w:br/>
+      </w:r>
+      <w:r>
+        <w:rPr>
+          <w:rFonts w:ascii="Consolas" w:hAnsi="Consolas"/>
+          <w:sz w:val="18"/>
+        </w:rPr>
+        <w:t xml:space="preserve">    SH --&gt; CL[CRM close-out · quote won]</w:t>
+      </w:r>
+    </w:p>
+    <w:p>
+      <w:pPr>
+        <w:pStyle w:val="ListBullet"/>
+      </w:pPr>
+      <w:r>
+        <w:rPr>
+          <w:b/>
+        </w:rPr>
+        <w:t>Owner:</w:t>
+      </w:r>
+      <w:r>
+        <w:t xml:space="preserve"> OPS (verify) → MK (build) → QA → SHIP; CS consulted on any ambiguity.</w:t>
+      </w:r>
+    </w:p>
+    <w:p>
+      <w:pPr>
+        <w:pStyle w:val="ListBullet"/>
+      </w:pPr>
+      <w:r>
+        <w:rPr>
+          <w:b/>
+        </w:rPr>
+        <w:t>Lead time / SLA:</w:t>
+      </w:r>
+      <w:r>
+        <w:t xml:space="preserve"> per quote (set in CRM); confirm at intake.</w:t>
+      </w:r>
+    </w:p>
+    <w:p>
+      <w:pPr>
+        <w:pStyle w:val="ListBullet"/>
+      </w:pPr>
+      <w:r>
+        <w:rPr>
+          <w:b/>
+        </w:rPr>
+        <w:t>Exceptions:</w:t>
+      </w:r>
+      <w:r>
+        <w:t xml:space="preserve"> spec ambiguity → </w:t>
+      </w:r>
+      <w:r>
+        <w:rPr>
+          <w:b/>
+        </w:rPr>
+        <w:t>CS confirms with customer before build</w:t>
+      </w:r>
+      <w:r>
+        <w:t xml:space="preserve"> (locked spec is authoritative, never silently changed); material substitution requires CS sign-off.</w:t>
+      </w:r>
+    </w:p>
+    <w:p>
+      <w:pPr>
+        <w:pStyle w:val="Heading3"/>
+      </w:pPr>
+      <w:r>
+        <w:t>12.3 Configurable shelves (Tile / Art Back / others) — operations</w:t>
+      </w:r>
+    </w:p>
+    <w:p>
+      <w:r>
+        <w:rPr>
+          <w:i/>
+          <w:color w:val="666666"/>
+          <w:sz w:val="18"/>
+        </w:rPr>
+        <w:t>Diagram (Mermaid source — renders as a diagram on GitHub):</w:t>
+      </w:r>
+    </w:p>
+    <w:p>
+      <w:pPr>
+        <w:shd w:val="clear" w:color="auto" w:fill="F4F4F2"/>
+        <w:ind w:left="216" w:right="216"/>
+      </w:pPr>
+      <w:r>
+        <w:rPr>
+          <w:rFonts w:ascii="Consolas" w:hAnsi="Consolas"/>
+          <w:sz w:val="18"/>
+        </w:rPr>
+        <w:t>flowchart TD</w:t>
+      </w:r>
+      <w:r>
+        <w:br/>
+      </w:r>
+      <w:r>
+        <w:rPr>
+          <w:rFonts w:ascii="Consolas" w:hAnsi="Consolas"/>
+          <w:sz w:val="18"/>
+        </w:rPr>
+        <w:t xml:space="preserve">    O[Order paid · config + BOM] --&gt; J{Style}</w:t>
+      </w:r>
+      <w:r>
+        <w:br/>
+      </w:r>
+      <w:r>
+        <w:rPr>
+          <w:rFonts w:ascii="Consolas" w:hAnsi="Consolas"/>
+          <w:sz w:val="18"/>
+        </w:rPr>
+        <w:t xml:space="preserve">    J --&gt;|Tile| T[Cut blank · layout tiles per count/pattern · set · seal]</w:t>
+      </w:r>
+      <w:r>
+        <w:br/>
+      </w:r>
+      <w:r>
+        <w:rPr>
+          <w:rFonts w:ascii="Consolas" w:hAnsi="Consolas"/>
+          <w:sz w:val="18"/>
+        </w:rPr>
+        <w:t xml:space="preserve">    J --&gt;|Art Back| A[Prep back panel · mount art asset · assemble]</w:t>
+      </w:r>
+      <w:r>
+        <w:br/>
+      </w:r>
+      <w:r>
+        <w:rPr>
+          <w:rFonts w:ascii="Consolas" w:hAnsi="Consolas"/>
+          <w:sz w:val="18"/>
+        </w:rPr>
+        <w:t xml:space="preserve">    J --&gt;|Other| X[Style-specific build routine]</w:t>
+      </w:r>
+      <w:r>
+        <w:br/>
+      </w:r>
+      <w:r>
+        <w:rPr>
+          <w:rFonts w:ascii="Consolas" w:hAnsi="Consolas"/>
+          <w:sz w:val="18"/>
+        </w:rPr>
+        <w:t xml:space="preserve">    T --&gt; F[Finish]</w:t>
+      </w:r>
+      <w:r>
+        <w:br/>
+      </w:r>
+      <w:r>
+        <w:rPr>
+          <w:rFonts w:ascii="Consolas" w:hAnsi="Consolas"/>
+          <w:sz w:val="18"/>
+        </w:rPr>
+        <w:t xml:space="preserve">    A --&gt; F</w:t>
+      </w:r>
+      <w:r>
+        <w:br/>
+      </w:r>
+      <w:r>
+        <w:rPr>
+          <w:rFonts w:ascii="Consolas" w:hAnsi="Consolas"/>
+          <w:sz w:val="18"/>
+        </w:rPr>
+        <w:t xml:space="preserve">    X --&gt; F</w:t>
+      </w:r>
+      <w:r>
+        <w:br/>
+      </w:r>
+      <w:r>
+        <w:rPr>
+          <w:rFonts w:ascii="Consolas" w:hAnsi="Consolas"/>
+          <w:sz w:val="18"/>
+        </w:rPr>
+        <w:t xml:space="preserve">    F --&gt; QA[QA vs render]</w:t>
+      </w:r>
+      <w:r>
+        <w:br/>
+      </w:r>
+      <w:r>
+        <w:rPr>
+          <w:rFonts w:ascii="Consolas" w:hAnsi="Consolas"/>
+          <w:sz w:val="18"/>
+        </w:rPr>
+        <w:t xml:space="preserve">    QA --&gt; PK[Pack]</w:t>
+      </w:r>
+      <w:r>
+        <w:br/>
+      </w:r>
+      <w:r>
+        <w:rPr>
+          <w:rFonts w:ascii="Consolas" w:hAnsi="Consolas"/>
+          <w:sz w:val="18"/>
+        </w:rPr>
+        <w:t xml:space="preserve">    PK --&gt; SH[Ship]</w:t>
+      </w:r>
+      <w:r>
+        <w:br/>
+      </w:r>
+      <w:r>
+        <w:rPr>
+          <w:rFonts w:ascii="Consolas" w:hAnsi="Consolas"/>
+          <w:sz w:val="18"/>
+        </w:rPr>
+        <w:t xml:space="preserve">    SH --&gt; CL[Close]</w:t>
+      </w:r>
+    </w:p>
+    <w:p>
+      <w:pPr>
+        <w:pStyle w:val="ListBullet"/>
+      </w:pPr>
+      <w:r>
+        <w:rPr>
+          <w:b/>
+        </w:rPr>
+        <w:t>Owner:</w:t>
+      </w:r>
+      <w:r>
+        <w:t xml:space="preserve"> MK (build per style jig/template) → QA → SHIP; OPS schedules by style queue.</w:t>
+      </w:r>
+    </w:p>
+    <w:p>
+      <w:pPr>
+        <w:pStyle w:val="ListBullet"/>
+      </w:pPr>
+      <w:r>
+        <w:rPr>
+          <w:b/>
+        </w:rPr>
+        <w:t>Style notes:</w:t>
+      </w:r>
+      <w:r>
+        <w:t xml:space="preserve"> </w:t>
+      </w:r>
+      <w:r>
+        <w:rPr>
+          <w:i/>
+        </w:rPr>
+        <w:t>Tile</w:t>
+      </w:r>
+      <w:r>
+        <w:t xml:space="preserve"> uses a layout jig keyed to tile count/pattern; </w:t>
+      </w:r>
+      <w:r>
+        <w:rPr>
+          <w:i/>
+        </w:rPr>
+        <w:t>Art Back</w:t>
+      </w:r>
+      <w:r>
+        <w:t xml:space="preserve"> keys to the selected back-art asset; new styles add a build routine, </w:t>
+      </w:r>
+      <w:r>
+        <w:rPr>
+          <w:b/>
+        </w:rPr>
+        <w:t>no process rewrite</w:t>
+      </w:r>
+      <w:r>
+        <w:t>.</w:t>
+      </w:r>
+    </w:p>
+    <w:p>
+      <w:pPr>
+        <w:pStyle w:val="ListBullet"/>
+      </w:pPr>
+      <w:r>
+        <w:rPr>
+          <w:b/>
+        </w:rPr>
+        <w:t>Lead time / SLA:</w:t>
+      </w:r>
+      <w:r>
+        <w:t xml:space="preserve"> typically 1–3 weeks depending on size/finish.</w:t>
+      </w:r>
+    </w:p>
+    <w:p>
+      <w:pPr>
+        <w:pStyle w:val="ListBullet"/>
+      </w:pPr>
+      <w:r>
+        <w:rPr>
+          <w:b/>
+        </w:rPr>
+        <w:t>Exceptions:</w:t>
+      </w:r>
+      <w:r>
+        <w:t xml:space="preserve"> component shortage → substitute (within rules) or CS comms; render mismatch at QA → rework before pack.</w:t>
+      </w:r>
+    </w:p>
+    <w:p>
+      <w:pPr>
+        <w:pStyle w:val="Heading3"/>
+      </w:pPr>
+      <w:r>
+        <w:t>12.4 Hybrid (CRM-seeded, customer-edited) — operations</w:t>
+      </w:r>
+    </w:p>
+    <w:p>
+      <w:r>
+        <w:rPr>
+          <w:i/>
+          <w:color w:val="666666"/>
+          <w:sz w:val="18"/>
+        </w:rPr>
+        <w:t>Diagram (Mermaid source — renders as a diagram on GitHub):</w:t>
+      </w:r>
+    </w:p>
+    <w:p>
+      <w:pPr>
+        <w:shd w:val="clear" w:color="auto" w:fill="F4F4F2"/>
+        <w:ind w:left="216" w:right="216"/>
+      </w:pPr>
+      <w:r>
+        <w:rPr>
+          <w:rFonts w:ascii="Consolas" w:hAnsi="Consolas"/>
+          <w:sz w:val="18"/>
+        </w:rPr>
+        <w:t>flowchart LR</w:t>
+      </w:r>
+      <w:r>
+        <w:br/>
+      </w:r>
+      <w:r>
+        <w:rPr>
+          <w:rFonts w:ascii="Consolas" w:hAnsi="Consolas"/>
+          <w:sz w:val="18"/>
+        </w:rPr>
+        <w:t xml:space="preserve">    O[Order paid] --&gt; R["Reconcile FINAL config:&lt;br/&gt;locked baseline + customer edits vs CRM"]</w:t>
+      </w:r>
+      <w:r>
+        <w:br/>
+      </w:r>
+      <w:r>
+        <w:rPr>
+          <w:rFonts w:ascii="Consolas" w:hAnsi="Consolas"/>
+          <w:sz w:val="18"/>
+        </w:rPr>
+        <w:t xml:space="preserve">    R --&gt; D{Edits change BOM or lead time?}</w:t>
+      </w:r>
+      <w:r>
+        <w:br/>
+      </w:r>
+      <w:r>
+        <w:rPr>
+          <w:rFonts w:ascii="Consolas" w:hAnsi="Consolas"/>
+          <w:sz w:val="18"/>
+        </w:rPr>
+        <w:t xml:space="preserve">    D --&gt;|Yes| C[CS confirm with customer + reschedule]</w:t>
+      </w:r>
+      <w:r>
+        <w:br/>
+      </w:r>
+      <w:r>
+        <w:rPr>
+          <w:rFonts w:ascii="Consolas" w:hAnsi="Consolas"/>
+          <w:sz w:val="18"/>
+        </w:rPr>
+        <w:t xml:space="preserve">    D --&gt;|No| MK[Build FINAL config]</w:t>
+      </w:r>
+      <w:r>
+        <w:br/>
+      </w:r>
+      <w:r>
+        <w:rPr>
+          <w:rFonts w:ascii="Consolas" w:hAnsi="Consolas"/>
+          <w:sz w:val="18"/>
+        </w:rPr>
+        <w:t xml:space="preserve">    C --&gt; MK</w:t>
+      </w:r>
+      <w:r>
+        <w:br/>
+      </w:r>
+      <w:r>
+        <w:rPr>
+          <w:rFonts w:ascii="Consolas" w:hAnsi="Consolas"/>
+          <w:sz w:val="18"/>
+        </w:rPr>
+        <w:t xml:space="preserve">    MK --&gt; QA[QA vs render]</w:t>
+      </w:r>
+      <w:r>
+        <w:br/>
+      </w:r>
+      <w:r>
+        <w:rPr>
+          <w:rFonts w:ascii="Consolas" w:hAnsi="Consolas"/>
+          <w:sz w:val="18"/>
+        </w:rPr>
+        <w:t xml:space="preserve">    QA --&gt; PK[Pack]</w:t>
+      </w:r>
+      <w:r>
+        <w:br/>
+      </w:r>
+      <w:r>
+        <w:rPr>
+          <w:rFonts w:ascii="Consolas" w:hAnsi="Consolas"/>
+          <w:sz w:val="18"/>
+        </w:rPr>
+        <w:t xml:space="preserve">    PK --&gt; SH[Ship]</w:t>
+      </w:r>
+      <w:r>
+        <w:br/>
+      </w:r>
+      <w:r>
+        <w:rPr>
+          <w:rFonts w:ascii="Consolas" w:hAnsi="Consolas"/>
+          <w:sz w:val="18"/>
+        </w:rPr>
+        <w:t xml:space="preserve">    SH --&gt; CL[CRM reconcile + close]</w:t>
+      </w:r>
+    </w:p>
+    <w:p>
+      <w:pPr>
+        <w:pStyle w:val="ListBullet"/>
+      </w:pPr>
+      <w:r>
+        <w:rPr>
+          <w:b/>
+        </w:rPr>
+        <w:t>Owner:</w:t>
+      </w:r>
+      <w:r>
+        <w:t xml:space="preserve"> OPS (reconcile) → MK → QA → SHIP; SYS reconciles final config back to the CRM quote.</w:t>
+      </w:r>
+    </w:p>
+    <w:p>
+      <w:pPr>
+        <w:pStyle w:val="ListBullet"/>
+      </w:pPr>
+      <w:r>
+        <w:rPr>
+          <w:b/>
+        </w:rPr>
+        <w:t>Critical rule:</w:t>
+      </w:r>
+      <w:r>
+        <w:t xml:space="preserve"> ops builds the </w:t>
+      </w:r>
+      <w:r>
+        <w:rPr>
+          <w:b/>
+        </w:rPr>
+        <w:t>final purchased configuration</w:t>
+      </w:r>
+      <w:r>
+        <w:t xml:space="preserve"> (locked baseline </w:t>
+      </w:r>
+      <w:r>
+        <w:rPr>
+          <w:b/>
+        </w:rPr>
+        <w:t>plus</w:t>
+      </w:r>
+      <w:r>
+        <w:t xml:space="preserve"> customer edits) — </w:t>
+      </w:r>
+      <w:r>
+        <w:rPr>
+          <w:i/>
+        </w:rPr>
+        <w:t>not</w:t>
+      </w:r>
+      <w:r>
+        <w:t xml:space="preserve"> the original quote. Always confirm which BOM is authoritative at intake.</w:t>
+      </w:r>
+    </w:p>
+    <w:p>
+      <w:pPr>
+        <w:pStyle w:val="ListBullet"/>
+      </w:pPr>
+      <w:r>
+        <w:rPr>
+          <w:b/>
+        </w:rPr>
+        <w:t>Lead time / SLA:</w:t>
+      </w:r>
+      <w:r>
+        <w:t xml:space="preserve"> as configurable; recompute if edits change the BOM.</w:t>
+      </w:r>
+    </w:p>
+    <w:p>
+      <w:pPr>
+        <w:pStyle w:val="ListBullet"/>
+      </w:pPr>
+      <w:r>
+        <w:rPr>
+          <w:b/>
+        </w:rPr>
+        <w:t>Exceptions:</w:t>
+      </w:r>
+      <w:r>
+        <w:t xml:space="preserve"> customer edits push past capacity/lead time → CS reschedule + confirm.</w:t>
+      </w:r>
+    </w:p>
+    <w:p>
+      <w:pPr>
+        <w:pStyle w:val="Heading3"/>
+      </w:pPr>
+      <w:r>
+        <w:t>12.5 Custom build-out (Atelier3d) — operations</w:t>
+      </w:r>
+    </w:p>
+    <w:p>
+      <w:r>
+        <w:rPr>
+          <w:i/>
+          <w:color w:val="666666"/>
+          <w:sz w:val="18"/>
+        </w:rPr>
+        <w:t>Diagram (Mermaid source — renders as a diagram on GitHub):</w:t>
+      </w:r>
+    </w:p>
+    <w:p>
+      <w:pPr>
+        <w:shd w:val="clear" w:color="auto" w:fill="F4F4F2"/>
+        <w:ind w:left="216" w:right="216"/>
+      </w:pPr>
+      <w:r>
+        <w:rPr>
+          <w:rFonts w:ascii="Consolas" w:hAnsi="Consolas"/>
+          <w:sz w:val="18"/>
+        </w:rPr>
+        <w:t>flowchart TD</w:t>
+      </w:r>
+      <w:r>
+        <w:br/>
+      </w:r>
+      <w:r>
+        <w:rPr>
+          <w:rFonts w:ascii="Consolas" w:hAnsi="Consolas"/>
+          <w:sz w:val="18"/>
+        </w:rPr>
+        <w:t xml:space="preserve">    O[Order or deposit · config + BOM + 4K] --&gt; FR[Feasibility confirm + shop drawing / cut list]</w:t>
+      </w:r>
+      <w:r>
+        <w:br/>
+      </w:r>
+      <w:r>
+        <w:rPr>
+          <w:rFonts w:ascii="Consolas" w:hAnsi="Consolas"/>
+          <w:sz w:val="18"/>
+        </w:rPr>
+        <w:t xml:space="preserve">    FR --&gt; SRC[Source materials incl. specialty]</w:t>
+      </w:r>
+      <w:r>
+        <w:br/>
+      </w:r>
+      <w:r>
+        <w:rPr>
+          <w:rFonts w:ascii="Consolas" w:hAnsi="Consolas"/>
+          <w:sz w:val="18"/>
+        </w:rPr>
+        <w:t xml:space="preserve">    SRC --&gt; MK[Build with in-process QA checkpoints]</w:t>
+      </w:r>
+      <w:r>
+        <w:br/>
+      </w:r>
+      <w:r>
+        <w:rPr>
+          <w:rFonts w:ascii="Consolas" w:hAnsi="Consolas"/>
+          <w:sz w:val="18"/>
+        </w:rPr>
+        <w:t xml:space="preserve">    MK --&gt; AP{Customer approval milestone?}</w:t>
+      </w:r>
+      <w:r>
+        <w:br/>
+      </w:r>
+      <w:r>
+        <w:rPr>
+          <w:rFonts w:ascii="Consolas" w:hAnsi="Consolas"/>
+          <w:sz w:val="18"/>
+        </w:rPr>
+        <w:t xml:space="preserve">    AP --&gt;|needed| CSF[CS shares progress photos to approve]</w:t>
+      </w:r>
+      <w:r>
+        <w:br/>
+      </w:r>
+      <w:r>
+        <w:rPr>
+          <w:rFonts w:ascii="Consolas" w:hAnsi="Consolas"/>
+          <w:sz w:val="18"/>
+        </w:rPr>
+        <w:t xml:space="preserve">    AP --&gt;|no| FIN[Finish]</w:t>
+      </w:r>
+      <w:r>
+        <w:br/>
+      </w:r>
+      <w:r>
+        <w:rPr>
+          <w:rFonts w:ascii="Consolas" w:hAnsi="Consolas"/>
+          <w:sz w:val="18"/>
+        </w:rPr>
+        <w:t xml:space="preserve">    CSF --&gt; FIN</w:t>
+      </w:r>
+      <w:r>
+        <w:br/>
+      </w:r>
+      <w:r>
+        <w:rPr>
+          <w:rFonts w:ascii="Consolas" w:hAnsi="Consolas"/>
+          <w:sz w:val="18"/>
+        </w:rPr>
+        <w:t xml:space="preserve">    FIN --&gt; QA[Final QA vs 4K render]</w:t>
+      </w:r>
+      <w:r>
+        <w:br/>
+      </w:r>
+      <w:r>
+        <w:rPr>
+          <w:rFonts w:ascii="Consolas" w:hAnsi="Consolas"/>
+          <w:sz w:val="18"/>
+        </w:rPr>
+        <w:t xml:space="preserve">    QA --&gt;|pass| PK[White-glove pack]</w:t>
+      </w:r>
+      <w:r>
+        <w:br/>
+      </w:r>
+      <w:r>
+        <w:rPr>
+          <w:rFonts w:ascii="Consolas" w:hAnsi="Consolas"/>
+          <w:sz w:val="18"/>
+        </w:rPr>
+        <w:t xml:space="preserve">    QA --&gt;|fail| RW[Rework]</w:t>
+      </w:r>
+      <w:r>
+        <w:br/>
+      </w:r>
+      <w:r>
+        <w:rPr>
+          <w:rFonts w:ascii="Consolas" w:hAnsi="Consolas"/>
+          <w:sz w:val="18"/>
+        </w:rPr>
+        <w:t xml:space="preserve">    RW --&gt; QA</w:t>
+      </w:r>
+      <w:r>
+        <w:br/>
+      </w:r>
+      <w:r>
+        <w:rPr>
+          <w:rFonts w:ascii="Consolas" w:hAnsi="Consolas"/>
+          <w:sz w:val="18"/>
+        </w:rPr>
+        <w:t xml:space="preserve">    PK --&gt; SH[Ship / delivery]</w:t>
+      </w:r>
+      <w:r>
+        <w:br/>
+      </w:r>
+      <w:r>
+        <w:rPr>
+          <w:rFonts w:ascii="Consolas" w:hAnsi="Consolas"/>
+          <w:sz w:val="18"/>
+        </w:rPr>
+        <w:t xml:space="preserve">    SH --&gt; CL[CRM close + post-sale]</w:t>
+      </w:r>
+    </w:p>
+    <w:p>
+      <w:pPr>
+        <w:pStyle w:val="ListBullet"/>
+      </w:pPr>
+      <w:r>
+        <w:rPr>
+          <w:b/>
+        </w:rPr>
+        <w:t>Owner:</w:t>
+      </w:r>
+      <w:r>
+        <w:t xml:space="preserve"> OPS + MK (highest-touch); CS owns customer approval milestones; QA accountable for final sign-off vs render.</w:t>
+      </w:r>
+    </w:p>
+    <w:p>
+      <w:pPr>
+        <w:pStyle w:val="ListBullet"/>
+      </w:pPr>
+      <w:r>
+        <w:rPr>
+          <w:b/>
+        </w:rPr>
+        <w:t>Lead time / SLA:</w:t>
+      </w:r>
+      <w:r>
+        <w:t xml:space="preserve"> longest; quoted per piece (often via CRM deposit path before build).</w:t>
+      </w:r>
+    </w:p>
+    <w:p>
+      <w:pPr>
+        <w:pStyle w:val="ListBullet"/>
+      </w:pPr>
+      <w:r>
+        <w:rPr>
+          <w:b/>
+        </w:rPr>
+        <w:t>Exceptions:</w:t>
+      </w:r>
+      <w:r>
+        <w:t xml:space="preserve"> post-order feasibility fail (rare) → CS + redesign or refund; specialty material delay → ETA comms; milestone rejection → revise before continuing.</w:t>
+      </w:r>
+    </w:p>
+    <w:p>
+      <w:pPr>
+        <w:pStyle w:val="Heading3"/>
+      </w:pPr>
+      <w:r>
+        <w:t>12.6 Cross-cutting operational flows</w:t>
+      </w:r>
+    </w:p>
+    <w:tbl>
+      <w:tblPr>
+        <w:tblStyle w:val="LightGrid-Accent1"/>
+        <w:tblW w:type="auto" w:w="0"/>
+        <w:tblLayout w:type="autofit"/>
+        <w:tblLook w:firstColumn="1" w:firstRow="1" w:lastColumn="0" w:lastRow="0" w:noHBand="0" w:noVBand="1" w:val="04A0"/>
+      </w:tblPr>
+      <w:tblGrid>
+        <w:gridCol w:w="4824"/>
+        <w:gridCol w:w="4824"/>
+      </w:tblGrid>
+      <w:tr>
+        <w:tc>
+          <w:tcPr>
+            <w:tcW w:type="dxa" w:w="4824"/>
+          </w:tcPr>
+          <w:p>
+            <w:r>
+              <w:rPr>
+                <w:b/>
+              </w:rPr>
+              <w:t>Flow</w:t>
+            </w:r>
+          </w:p>
+        </w:tc>
+        <w:tc>
+          <w:tcPr>
+            <w:tcW w:type="dxa" w:w="4824"/>
+          </w:tcPr>
+          <w:p>
+            <w:r>
+              <w:rPr>
+                <w:b/>
+              </w:rPr>
+              <w:t>What it does</w:t>
+            </w:r>
+          </w:p>
+        </w:tc>
+      </w:tr>
+      <w:tr>
+        <w:tc>
+          <w:tcPr>
+            <w:tcW w:type="dxa" w:w="4824"/>
+          </w:tcPr>
+          <w:p>
+            <w:r>
+              <w:rPr>
+                <w:b/>
+              </w:rPr>
+              <w:t>Materials &amp; inventory</w:t>
+            </w:r>
+          </w:p>
+        </w:tc>
+        <w:tc>
+          <w:tcPr>
+            <w:tcW w:type="dxa" w:w="4824"/>
+          </w:tcPr>
+          <w:p>
+            <w:r>
+              <w:t>BOM → stock check → reorder; maintain safety stock for common woods/tiles/finishes; flag long-lead specialty items at intake.</w:t>
+            </w:r>
+          </w:p>
+        </w:tc>
+      </w:tr>
+      <w:tr>
+        <w:tc>
+          <w:tcPr>
+            <w:tcW w:type="dxa" w:w="4824"/>
+          </w:tcPr>
+          <w:p>
+            <w:r>
+              <w:rPr>
+                <w:b/>
+              </w:rPr>
+              <w:t>QA — render vs build</w:t>
+            </w:r>
+          </w:p>
+        </w:tc>
+        <w:tc>
+          <w:tcPr>
+            <w:tcW w:type="dxa" w:w="4824"/>
+          </w:tcPr>
+          <w:p>
+            <w:r>
+              <w:t xml:space="preserve">The approved </w:t>
+            </w:r>
+            <w:r>
+              <w:rPr>
+                <w:b/>
+              </w:rPr>
+              <w:t>4K render is the spec of record</w:t>
+            </w:r>
+            <w:r>
+              <w:t>; QA verifies the built piece matches it (dimensions, wood, finish, layout) before pack.</w:t>
+            </w:r>
+          </w:p>
+        </w:tc>
+      </w:tr>
+      <w:tr>
+        <w:tc>
+          <w:tcPr>
+            <w:tcW w:type="dxa" w:w="4824"/>
+          </w:tcPr>
+          <w:p>
+            <w:r>
+              <w:rPr>
+                <w:b/>
+              </w:rPr>
+              <w:t>Returns / rework / warranty</w:t>
+            </w:r>
+          </w:p>
+        </w:tc>
+        <w:tc>
+          <w:tcPr>
+            <w:tcW w:type="dxa" w:w="4824"/>
+          </w:tcPr>
+          <w:p>
+            <w:r>
+              <w:t>Made-to-order &amp; custom are limited/no-return by policy (set in CS comms); defects → rework or remake; warranty claims logged to CRM.</w:t>
+            </w:r>
+          </w:p>
+        </w:tc>
+      </w:tr>
+      <w:tr>
+        <w:tc>
+          <w:tcPr>
+            <w:tcW w:type="dxa" w:w="4824"/>
+          </w:tcPr>
+          <w:p>
+            <w:r>
+              <w:rPr>
+                <w:b/>
+              </w:rPr>
+              <w:t>Capacity &amp; scheduling</w:t>
+            </w:r>
+          </w:p>
+        </w:tc>
+        <w:tc>
+          <w:tcPr>
+            <w:tcW w:type="dxa" w:w="4824"/>
+          </w:tcPr>
+          <w:p>
+            <w:r>
+              <w:t>OPS queues by product type; WIP limits per maker; lead-time SLAs published to CS so quotes/PDP show realistic ship dates.</w:t>
+            </w:r>
+          </w:p>
+        </w:tc>
+      </w:tr>
+    </w:tbl>
+    <w:p/>
+    <w:p>
+      <w:pPr>
+        <w:pStyle w:val="Heading3"/>
+      </w:pPr>
+      <w:r>
+        <w:t>12.7 Operational RACI (by stage)</w:t>
+      </w:r>
+    </w:p>
+    <w:tbl>
+      <w:tblPr>
+        <w:tblStyle w:val="LightGrid-Accent1"/>
+        <w:tblW w:type="auto" w:w="0"/>
+        <w:tblLayout w:type="autofit"/>
+        <w:tblLook w:firstColumn="1" w:firstRow="1" w:lastColumn="0" w:lastRow="0" w:noHBand="0" w:noVBand="1" w:val="04A0"/>
+      </w:tblPr>
+      <w:tblGrid>
+        <w:gridCol w:w="2412"/>
+        <w:gridCol w:w="2412"/>
+        <w:gridCol w:w="2412"/>
+        <w:gridCol w:w="2412"/>
+      </w:tblGrid>
+      <w:tr>
+        <w:tc>
+          <w:tcPr>
+            <w:tcW w:type="dxa" w:w="2412"/>
+          </w:tcPr>
+          <w:p>
+            <w:r>
+              <w:rPr>
+                <w:b/>
+              </w:rPr>
+              <w:t>Operational stage</w:t>
+            </w:r>
+          </w:p>
+        </w:tc>
+        <w:tc>
+          <w:tcPr>
+            <w:tcW w:type="dxa" w:w="2412"/>
+          </w:tcPr>
+          <w:p>
+            <w:r>
+              <w:rPr>
+                <w:b/>
+              </w:rPr>
+              <w:t>R (does it)</w:t>
+            </w:r>
+          </w:p>
+        </w:tc>
+        <w:tc>
+          <w:tcPr>
+            <w:tcW w:type="dxa" w:w="2412"/>
+          </w:tcPr>
+          <w:p>
+            <w:r>
+              <w:rPr>
+                <w:b/>
+              </w:rPr>
+              <w:t>A (owns outcome)</w:t>
+            </w:r>
+          </w:p>
+        </w:tc>
+        <w:tc>
+          <w:tcPr>
+            <w:tcW w:type="dxa" w:w="2412"/>
+          </w:tcPr>
+          <w:p>
+            <w:r>
+              <w:rPr>
+                <w:b/>
+              </w:rPr>
+              <w:t>C / I</w:t>
+            </w:r>
+          </w:p>
+        </w:tc>
+      </w:tr>
+      <w:tr>
+        <w:tc>
+          <w:tcPr>
+            <w:tcW w:type="dxa" w:w="2412"/>
+          </w:tcPr>
+          <w:p>
+            <w:r>
+              <w:t>Intake / packet receipt</w:t>
+            </w:r>
+          </w:p>
+        </w:tc>
+        <w:tc>
+          <w:tcPr>
+            <w:tcW w:type="dxa" w:w="2412"/>
+          </w:tcPr>
+          <w:p>
+            <w:r>
+              <w:t>SYS → OPS</w:t>
+            </w:r>
+          </w:p>
+        </w:tc>
+        <w:tc>
+          <w:tcPr>
+            <w:tcW w:type="dxa" w:w="2412"/>
+          </w:tcPr>
+          <w:p>
+            <w:r>
+              <w:t>OPS</w:t>
+            </w:r>
+          </w:p>
+        </w:tc>
+        <w:tc>
+          <w:tcPr>
+            <w:tcW w:type="dxa" w:w="2412"/>
+          </w:tcPr>
+          <w:p>
+            <w:r>
+              <w:t>CS</w:t>
+            </w:r>
+          </w:p>
+        </w:tc>
+      </w:tr>
+      <w:tr>
+        <w:tc>
+          <w:tcPr>
+            <w:tcW w:type="dxa" w:w="2412"/>
+          </w:tcPr>
+          <w:p>
+            <w:r>
+              <w:t>Spec verify &amp; feasibility</w:t>
+            </w:r>
+          </w:p>
+        </w:tc>
+        <w:tc>
+          <w:tcPr>
+            <w:tcW w:type="dxa" w:w="2412"/>
+          </w:tcPr>
+          <w:p>
+            <w:r>
+              <w:t>OPS</w:t>
+            </w:r>
+          </w:p>
+        </w:tc>
+        <w:tc>
+          <w:tcPr>
+            <w:tcW w:type="dxa" w:w="2412"/>
+          </w:tcPr>
+          <w:p>
+            <w:r>
+              <w:t>OPS</w:t>
+            </w:r>
+          </w:p>
+        </w:tc>
+        <w:tc>
+          <w:tcPr>
+            <w:tcW w:type="dxa" w:w="2412"/>
+          </w:tcPr>
+          <w:p>
+            <w:r>
+              <w:t>CS, MK (custom)</w:t>
+            </w:r>
+          </w:p>
+        </w:tc>
+      </w:tr>
+      <w:tr>
+        <w:tc>
+          <w:tcPr>
+            <w:tcW w:type="dxa" w:w="2412"/>
+          </w:tcPr>
+          <w:p>
+            <w:r>
+              <w:t>Source materials (BOM)</w:t>
+            </w:r>
+          </w:p>
+        </w:tc>
+        <w:tc>
+          <w:tcPr>
+            <w:tcW w:type="dxa" w:w="2412"/>
+          </w:tcPr>
+          <w:p>
+            <w:r>
+              <w:t>OPS</w:t>
+            </w:r>
+          </w:p>
+        </w:tc>
+        <w:tc>
+          <w:tcPr>
+            <w:tcW w:type="dxa" w:w="2412"/>
+          </w:tcPr>
+          <w:p>
+            <w:r>
+              <w:t>OPS</w:t>
+            </w:r>
+          </w:p>
+        </w:tc>
+        <w:tc>
+          <w:tcPr>
+            <w:tcW w:type="dxa" w:w="2412"/>
+          </w:tcPr>
+          <w:p>
+            <w:r>
+              <w:t>MK</w:t>
+            </w:r>
+          </w:p>
+        </w:tc>
+      </w:tr>
+      <w:tr>
+        <w:tc>
+          <w:tcPr>
+            <w:tcW w:type="dxa" w:w="2412"/>
+          </w:tcPr>
+          <w:p>
+            <w:r>
+              <w:t>Build</w:t>
+            </w:r>
+          </w:p>
+        </w:tc>
+        <w:tc>
+          <w:tcPr>
+            <w:tcW w:type="dxa" w:w="2412"/>
+          </w:tcPr>
+          <w:p>
+            <w:r>
+              <w:t>MK</w:t>
+            </w:r>
+          </w:p>
+        </w:tc>
+        <w:tc>
+          <w:tcPr>
+            <w:tcW w:type="dxa" w:w="2412"/>
+          </w:tcPr>
+          <w:p>
+            <w:r>
+              <w:t>OPS</w:t>
+            </w:r>
+          </w:p>
+        </w:tc>
+        <w:tc>
+          <w:tcPr>
+            <w:tcW w:type="dxa" w:w="2412"/>
+          </w:tcPr>
+          <w:p>
+            <w:r>
+              <w:t>QA</w:t>
+            </w:r>
+          </w:p>
+        </w:tc>
+      </w:tr>
+      <w:tr>
+        <w:tc>
+          <w:tcPr>
+            <w:tcW w:type="dxa" w:w="2412"/>
+          </w:tcPr>
+          <w:p>
+            <w:r>
+              <w:t>QA vs approved render</w:t>
+            </w:r>
+          </w:p>
+        </w:tc>
+        <w:tc>
+          <w:tcPr>
+            <w:tcW w:type="dxa" w:w="2412"/>
+          </w:tcPr>
+          <w:p>
+            <w:r>
+              <w:t>QA</w:t>
+            </w:r>
+          </w:p>
+        </w:tc>
+        <w:tc>
+          <w:tcPr>
+            <w:tcW w:type="dxa" w:w="2412"/>
+          </w:tcPr>
+          <w:p>
+            <w:r>
+              <w:t>OPS</w:t>
+            </w:r>
+          </w:p>
+        </w:tc>
+        <w:tc>
+          <w:tcPr>
+            <w:tcW w:type="dxa" w:w="2412"/>
+          </w:tcPr>
+          <w:p>
+            <w:r>
+              <w:t>MK</w:t>
+            </w:r>
+          </w:p>
+        </w:tc>
+      </w:tr>
+      <w:tr>
+        <w:tc>
+          <w:tcPr>
+            <w:tcW w:type="dxa" w:w="2412"/>
+          </w:tcPr>
+          <w:p>
+            <w:r>
+              <w:t>Pack &amp; ship</w:t>
+            </w:r>
+          </w:p>
+        </w:tc>
+        <w:tc>
+          <w:tcPr>
+            <w:tcW w:type="dxa" w:w="2412"/>
+          </w:tcPr>
+          <w:p>
+            <w:r>
+              <w:t>SHIP</w:t>
+            </w:r>
+          </w:p>
+        </w:tc>
+        <w:tc>
+          <w:tcPr>
+            <w:tcW w:type="dxa" w:w="2412"/>
+          </w:tcPr>
+          <w:p>
+            <w:r>
+              <w:t>OPS</w:t>
+            </w:r>
+          </w:p>
+        </w:tc>
+        <w:tc>
+          <w:tcPr>
+            <w:tcW w:type="dxa" w:w="2412"/>
+          </w:tcPr>
+          <w:p>
+            <w:r>
+              <w:t>CS</w:t>
+            </w:r>
+          </w:p>
+        </w:tc>
+      </w:tr>
+      <w:tr>
+        <w:tc>
+          <w:tcPr>
+            <w:tcW w:type="dxa" w:w="2412"/>
+          </w:tcPr>
+          <w:p>
+            <w:r>
+              <w:t>Close-out / CRM reconcile</w:t>
+            </w:r>
+          </w:p>
+        </w:tc>
+        <w:tc>
+          <w:tcPr>
+            <w:tcW w:type="dxa" w:w="2412"/>
+          </w:tcPr>
+          <w:p>
+            <w:r>
+              <w:t>SYS</w:t>
+            </w:r>
+          </w:p>
+        </w:tc>
+        <w:tc>
+          <w:tcPr>
+            <w:tcW w:type="dxa" w:w="2412"/>
+          </w:tcPr>
+          <w:p>
+            <w:r>
+              <w:t>OPS</w:t>
+            </w:r>
+          </w:p>
+        </w:tc>
+        <w:tc>
+          <w:tcPr>
+            <w:tcW w:type="dxa" w:w="2412"/>
+          </w:tcPr>
+          <w:p>
+            <w:r>
+              <w:t>CS</w:t>
+            </w:r>
+          </w:p>
+        </w:tc>
+      </w:tr>
+    </w:tbl>
+    <w:p/>
+    <w:p>
+      <w:pPr>
+        <w:pStyle w:val="Heading3"/>
+      </w:pPr>
+      <w:r>
+        <w:t>12.8 Operational metrics (feed the KPIs in Master Plan §14)</w:t>
+      </w:r>
+    </w:p>
+    <w:p>
+      <w:pPr>
+        <w:pStyle w:val="ListBullet"/>
+      </w:pPr>
+      <w:r>
+        <w:rPr>
+          <w:b/>
+        </w:rPr>
+        <w:t>On-time-ship rate</w:t>
+      </w:r>
+      <w:r>
+        <w:t xml:space="preserve"> vs. promised lead time, per product type.</w:t>
+      </w:r>
+    </w:p>
+    <w:p>
+      <w:pPr>
+        <w:pStyle w:val="ListBullet"/>
+      </w:pPr>
+      <w:r>
+        <w:rPr>
+          <w:b/>
+        </w:rPr>
+        <w:t>First-pass QA yield</w:t>
+      </w:r>
+      <w:r>
+        <w:t xml:space="preserve"> (built right the first time; render-match rate).</w:t>
+      </w:r>
+    </w:p>
+    <w:p>
+      <w:pPr>
+        <w:pStyle w:val="ListBullet"/>
+      </w:pPr>
+      <w:r>
+        <w:rPr>
+          <w:b/>
+        </w:rPr>
+        <w:t>Rework rate</w:t>
+      </w:r>
+      <w:r>
+        <w:t xml:space="preserve"> and average rework time.</w:t>
+      </w:r>
+    </w:p>
+    <w:p>
+      <w:pPr>
+        <w:pStyle w:val="ListBullet"/>
+      </w:pPr>
+      <w:r>
+        <w:rPr>
+          <w:b/>
+        </w:rPr>
+        <w:t>Production cycle time</w:t>
+      </w:r>
+      <w:r>
+        <w:t xml:space="preserve"> per type (intake → ship).</w:t>
+      </w:r>
+    </w:p>
+    <w:p>
+      <w:pPr>
+        <w:pStyle w:val="ListBullet"/>
+      </w:pPr>
+      <w:r>
+        <w:rPr>
+          <w:b/>
+        </w:rPr>
+        <w:t>Material stockout incidents</w:t>
+      </w:r>
+      <w:r>
+        <w:t xml:space="preserve"> affecting promised dates.</w:t>
+      </w:r>
+    </w:p>
+    <w:p>
+      <w:pPr>
+        <w:pBdr>
+          <w:bottom w:val="single" w:sz="6" w:space="1" w:color="BBBBBB"/>
+        </w:pBdr>
+      </w:pPr>
+    </w:p>
+    <w:p>
+      <w:r>
+        <w:rPr>
+          <w:i/>
+        </w:rPr>
+        <w:t>End of Product Workflows (Draft v0.1). Please approve the flows — customer/system (§2–9) and operational (§12) — and the open question in §10.</w:t>
       </w:r>
     </w:p>
     <w:sectPr>

</xml_diff>